<commit_message>
Style hyperlinks in the testimony Word template
</commit_message>
<xml_diff>
--- a/lib/just/templates/expert_testimony.docx
+++ b/lib/just/templates/expert_testimony.docx
@@ -882,6 +882,15 @@
     <w:basedOn w:val="DefaultParagraphFont"/>
     <w:rPr>
       <w:vertAlign w:val="superscript"/>
+    </w:rPr>
+  </w:style>
+  <w:style w:type="character" w:styleId="Hyperlink">
+    <w:name w:val="Hyperlink"/>
+    <w:basedOn w:val="DefaultParagraphFont"/>
+    <w:uiPriority w:val="99"/>
+    <w:rPr>
+      <w:color w:val="0563C1"/>
+      <w:u w:val="single"/>
     </w:rPr>
   </w:style>
   <w:style w:type="paragraph" w:styleId="Header">

</xml_diff>